<commit_message>
docs(ev2): agregar informe con diagramas, PDF y PPT final
- Informe Word con 13 diagramas arquitectónicos insertados (modelo 4+1 Kruchten)
- PDF exportado desde el informe final
- PPT de presentación Evaluación 2 finalizado
- Passdown sesión 2026-05-27

Co-Authored-By: Claude Sonnet 4.6 <noreply@anthropic.com>
</commit_message>
<xml_diff>
--- a/Documentación/Evaluacion_2/Informe_Evaluacion_2_MaduraApp.docx
+++ b/Documentación/Evaluacion_2/Informe_Evaluacion_2_MaduraApp.docx
@@ -2022,6 +2022,60 @@
     </w:p>
     <w:p>
       <w:pPr>
+        <w:spacing w:before="120" w:after="40"/>
+        <w:jc w:val="center"/>
+      </w:pPr>
+      <w:r>
+        <w:drawing>
+          <wp:inline xmlns:a="http://schemas.openxmlformats.org/drawingml/2006/main" xmlns:pic="http://schemas.openxmlformats.org/drawingml/2006/picture">
+            <wp:extent cx="5731510" cy="5091723"/>
+            <wp:docPr id="2" name="Picture 2"/>
+            <wp:cNvGraphicFramePr>
+              <a:graphicFrameLocks noChangeAspect="1"/>
+            </wp:cNvGraphicFramePr>
+            <a:graphic>
+              <a:graphicData uri="http://schemas.openxmlformats.org/drawingml/2006/picture">
+                <pic:pic>
+                  <pic:nvPicPr>
+                    <pic:cNvPr id="0" name="Diagrama de clases.png"/>
+                    <pic:cNvPicPr/>
+                  </pic:nvPicPr>
+                  <pic:blipFill>
+                    <a:blip r:embed="rId12"/>
+                    <a:stretch>
+                      <a:fillRect/>
+                    </a:stretch>
+                  </pic:blipFill>
+                  <pic:spPr>
+                    <a:xfrm>
+                      <a:off x="0" y="0"/>
+                      <a:ext cx="5731510" cy="5091723"/>
+                    </a:xfrm>
+                    <a:prstGeom prst="rect"/>
+                  </pic:spPr>
+                </pic:pic>
+              </a:graphicData>
+            </a:graphic>
+          </wp:inline>
+        </w:drawing>
+      </w:r>
+    </w:p>
+    <w:p>
+      <w:pPr>
+        <w:spacing w:after="200"/>
+        <w:jc w:val="center"/>
+      </w:pPr>
+      <w:r>
+        <w:rPr>
+          <w:i/>
+          <w:color w:val="595959"/>
+          <w:sz w:val="18"/>
+        </w:rPr>
+        <w:t>Figura 2. Diagrama de clases del dominio</w:t>
+      </w:r>
+    </w:p>
+    <w:p>
+      <w:pPr>
         <w:spacing w:before="60" w:after="80"/>
       </w:pPr>
     </w:p>
@@ -2106,6 +2160,60 @@
           <w:bCs/>
         </w:rPr>
         <w:t>Componentes lógicos:</w:t>
+      </w:r>
+    </w:p>
+    <w:p>
+      <w:pPr>
+        <w:spacing w:before="120" w:after="40"/>
+        <w:jc w:val="center"/>
+      </w:pPr>
+      <w:r>
+        <w:drawing>
+          <wp:inline xmlns:a="http://schemas.openxmlformats.org/drawingml/2006/main" xmlns:pic="http://schemas.openxmlformats.org/drawingml/2006/picture">
+            <wp:extent cx="5352301" cy="7800000"/>
+            <wp:docPr id="1" name="Picture 1"/>
+            <wp:cNvGraphicFramePr>
+              <a:graphicFrameLocks noChangeAspect="1"/>
+            </wp:cNvGraphicFramePr>
+            <a:graphic>
+              <a:graphicData uri="http://schemas.openxmlformats.org/drawingml/2006/picture">
+                <pic:pic>
+                  <pic:nvPicPr>
+                    <pic:cNvPr id="0" name="Diagrama de componentes lógicos.png"/>
+                    <pic:cNvPicPr/>
+                  </pic:nvPicPr>
+                  <pic:blipFill>
+                    <a:blip r:embed="rId11"/>
+                    <a:stretch>
+                      <a:fillRect/>
+                    </a:stretch>
+                  </pic:blipFill>
+                  <pic:spPr>
+                    <a:xfrm>
+                      <a:off x="0" y="0"/>
+                      <a:ext cx="5352301" cy="7800000"/>
+                    </a:xfrm>
+                    <a:prstGeom prst="rect"/>
+                  </pic:spPr>
+                </pic:pic>
+              </a:graphicData>
+            </a:graphic>
+          </wp:inline>
+        </w:drawing>
+      </w:r>
+    </w:p>
+    <w:p>
+      <w:pPr>
+        <w:spacing w:after="200"/>
+        <w:jc w:val="center"/>
+      </w:pPr>
+      <w:r>
+        <w:rPr>
+          <w:i/>
+          <w:color w:val="595959"/>
+          <w:sz w:val="18"/>
+        </w:rPr>
+        <w:t>Figura 1. Diagrama de componentes lógicos del backend</w:t>
       </w:r>
     </w:p>
     <w:tbl>
@@ -4140,6 +4248,60 @@
         <w:t>Modelo de concurrencia:</w:t>
       </w:r>
     </w:p>
+    <w:p>
+      <w:pPr>
+        <w:spacing w:before="120" w:after="40"/>
+        <w:jc w:val="center"/>
+      </w:pPr>
+      <w:r>
+        <w:drawing>
+          <wp:inline xmlns:a="http://schemas.openxmlformats.org/drawingml/2006/main" xmlns:pic="http://schemas.openxmlformats.org/drawingml/2006/picture">
+            <wp:extent cx="5731510" cy="1390734"/>
+            <wp:docPr id="3" name="Picture 3"/>
+            <wp:cNvGraphicFramePr>
+              <a:graphicFrameLocks noChangeAspect="1"/>
+            </wp:cNvGraphicFramePr>
+            <a:graphic>
+              <a:graphicData uri="http://schemas.openxmlformats.org/drawingml/2006/picture">
+                <pic:pic>
+                  <pic:nvPicPr>
+                    <pic:cNvPr id="0" name="Concurrencia inter-sistemas.png"/>
+                    <pic:cNvPicPr/>
+                  </pic:nvPicPr>
+                  <pic:blipFill>
+                    <a:blip r:embed="rId13"/>
+                    <a:stretch>
+                      <a:fillRect/>
+                    </a:stretch>
+                  </pic:blipFill>
+                  <pic:spPr>
+                    <a:xfrm>
+                      <a:off x="0" y="0"/>
+                      <a:ext cx="5731510" cy="1390734"/>
+                    </a:xfrm>
+                    <a:prstGeom prst="rect"/>
+                  </pic:spPr>
+                </pic:pic>
+              </a:graphicData>
+            </a:graphic>
+          </wp:inline>
+        </w:drawing>
+      </w:r>
+    </w:p>
+    <w:p>
+      <w:pPr>
+        <w:spacing w:after="200"/>
+        <w:jc w:val="center"/>
+      </w:pPr>
+      <w:r>
+        <w:rPr>
+          <w:i/>
+          <w:color w:val="595959"/>
+          <w:sz w:val="18"/>
+        </w:rPr>
+        <w:t>Figura 3. Modelo de concurrencia inter-sistemas</w:t>
+      </w:r>
+    </w:p>
     <w:tbl>
       <w:tblPr>
         <w:tblW w:w="9026" w:type="dxa"/>
@@ -4892,6 +5054,114 @@
     </w:p>
     <w:p>
       <w:pPr>
+        <w:spacing w:before="120" w:after="40"/>
+        <w:jc w:val="center"/>
+      </w:pPr>
+      <w:r>
+        <w:drawing>
+          <wp:inline xmlns:a="http://schemas.openxmlformats.org/drawingml/2006/main" xmlns:pic="http://schemas.openxmlformats.org/drawingml/2006/picture">
+            <wp:extent cx="5731510" cy="3654363"/>
+            <wp:docPr id="4" name="Picture 4"/>
+            <wp:cNvGraphicFramePr>
+              <a:graphicFrameLocks noChangeAspect="1"/>
+            </wp:cNvGraphicFramePr>
+            <a:graphic>
+              <a:graphicData uri="http://schemas.openxmlformats.org/drawingml/2006/picture">
+                <pic:pic>
+                  <pic:nvPicPr>
+                    <pic:cNvPr id="0" name="Diagrama de secuencia.png"/>
+                    <pic:cNvPicPr/>
+                  </pic:nvPicPr>
+                  <pic:blipFill>
+                    <a:blip r:embed="rId14"/>
+                    <a:stretch>
+                      <a:fillRect/>
+                    </a:stretch>
+                  </pic:blipFill>
+                  <pic:spPr>
+                    <a:xfrm>
+                      <a:off x="0" y="0"/>
+                      <a:ext cx="5731510" cy="3654363"/>
+                    </a:xfrm>
+                    <a:prstGeom prst="rect"/>
+                  </pic:spPr>
+                </pic:pic>
+              </a:graphicData>
+            </a:graphic>
+          </wp:inline>
+        </w:drawing>
+      </w:r>
+    </w:p>
+    <w:p>
+      <w:pPr>
+        <w:spacing w:after="200"/>
+        <w:jc w:val="center"/>
+      </w:pPr>
+      <w:r>
+        <w:rPr>
+          <w:i/>
+          <w:color w:val="595959"/>
+          <w:sz w:val="18"/>
+        </w:rPr>
+        <w:t>Figura 4. Diagrama de secuencia — CU-01 Escaneo con cámara</w:t>
+      </w:r>
+    </w:p>
+    <w:p>
+      <w:pPr>
+        <w:spacing w:before="120" w:after="40"/>
+        <w:jc w:val="center"/>
+      </w:pPr>
+      <w:r>
+        <w:drawing>
+          <wp:inline xmlns:a="http://schemas.openxmlformats.org/drawingml/2006/main" xmlns:pic="http://schemas.openxmlformats.org/drawingml/2006/picture">
+            <wp:extent cx="2659365" cy="7800000"/>
+            <wp:docPr id="5" name="Picture 5"/>
+            <wp:cNvGraphicFramePr>
+              <a:graphicFrameLocks noChangeAspect="1"/>
+            </wp:cNvGraphicFramePr>
+            <a:graphic>
+              <a:graphicData uri="http://schemas.openxmlformats.org/drawingml/2006/picture">
+                <pic:pic>
+                  <pic:nvPicPr>
+                    <pic:cNvPr id="0" name="Diagrama de actividades.png"/>
+                    <pic:cNvPicPr/>
+                  </pic:nvPicPr>
+                  <pic:blipFill>
+                    <a:blip r:embed="rId15"/>
+                    <a:stretch>
+                      <a:fillRect/>
+                    </a:stretch>
+                  </pic:blipFill>
+                  <pic:spPr>
+                    <a:xfrm>
+                      <a:off x="0" y="0"/>
+                      <a:ext cx="2659365" cy="7800000"/>
+                    </a:xfrm>
+                    <a:prstGeom prst="rect"/>
+                  </pic:spPr>
+                </pic:pic>
+              </a:graphicData>
+            </a:graphic>
+          </wp:inline>
+        </w:drawing>
+      </w:r>
+    </w:p>
+    <w:p>
+      <w:pPr>
+        <w:spacing w:after="200"/>
+        <w:jc w:val="center"/>
+      </w:pPr>
+      <w:r>
+        <w:rPr>
+          <w:i/>
+          <w:color w:val="595959"/>
+          <w:sz w:val="18"/>
+        </w:rPr>
+        <w:t>Figura 5. Diagrama de actividades — flujo de escaneo</w:t>
+      </w:r>
+    </w:p>
+    <w:p>
+      <w:pPr>
         <w:spacing w:before="60" w:after="80"/>
       </w:pPr>
     </w:p>
@@ -5571,6 +5841,114 @@
     </w:p>
     <w:p>
       <w:pPr>
+        <w:spacing w:before="120" w:after="40"/>
+        <w:jc w:val="center"/>
+      </w:pPr>
+      <w:r>
+        <w:drawing>
+          <wp:inline xmlns:a="http://schemas.openxmlformats.org/drawingml/2006/main" xmlns:pic="http://schemas.openxmlformats.org/drawingml/2006/picture">
+            <wp:extent cx="5731510" cy="3343857"/>
+            <wp:docPr id="6" name="Picture 6"/>
+            <wp:cNvGraphicFramePr>
+              <a:graphicFrameLocks noChangeAspect="1"/>
+            </wp:cNvGraphicFramePr>
+            <a:graphic>
+              <a:graphicData uri="http://schemas.openxmlformats.org/drawingml/2006/picture">
+                <pic:pic>
+                  <pic:nvPicPr>
+                    <pic:cNvPr id="0" name="State diagram.png"/>
+                    <pic:cNvPicPr/>
+                  </pic:nvPicPr>
+                  <pic:blipFill>
+                    <a:blip r:embed="rId16"/>
+                    <a:stretch>
+                      <a:fillRect/>
+                    </a:stretch>
+                  </pic:blipFill>
+                  <pic:spPr>
+                    <a:xfrm>
+                      <a:off x="0" y="0"/>
+                      <a:ext cx="5731510" cy="3343857"/>
+                    </a:xfrm>
+                    <a:prstGeom prst="rect"/>
+                  </pic:spPr>
+                </pic:pic>
+              </a:graphicData>
+            </a:graphic>
+          </wp:inline>
+        </w:drawing>
+      </w:r>
+    </w:p>
+    <w:p>
+      <w:pPr>
+        <w:spacing w:after="200"/>
+        <w:jc w:val="center"/>
+      </w:pPr>
+      <w:r>
+        <w:rPr>
+          <w:i/>
+          <w:color w:val="595959"/>
+          <w:sz w:val="18"/>
+        </w:rPr>
+        <w:t>Figura 6. Máquina de estados de ScanState</w:t>
+      </w:r>
+    </w:p>
+    <w:p>
+      <w:pPr>
+        <w:spacing w:before="120" w:after="40"/>
+        <w:jc w:val="center"/>
+      </w:pPr>
+      <w:r>
+        <w:drawing>
+          <wp:inline xmlns:a="http://schemas.openxmlformats.org/drawingml/2006/main" xmlns:pic="http://schemas.openxmlformats.org/drawingml/2006/picture">
+            <wp:extent cx="5731510" cy="3854232"/>
+            <wp:docPr id="7" name="Picture 7"/>
+            <wp:cNvGraphicFramePr>
+              <a:graphicFrameLocks noChangeAspect="1"/>
+            </wp:cNvGraphicFramePr>
+            <a:graphic>
+              <a:graphicData uri="http://schemas.openxmlformats.org/drawingml/2006/picture">
+                <pic:pic>
+                  <pic:nvPicPr>
+                    <pic:cNvPr id="0" name="Transiciones válidas.png"/>
+                    <pic:cNvPicPr/>
+                  </pic:nvPicPr>
+                  <pic:blipFill>
+                    <a:blip r:embed="rId17"/>
+                    <a:stretch>
+                      <a:fillRect/>
+                    </a:stretch>
+                  </pic:blipFill>
+                  <pic:spPr>
+                    <a:xfrm>
+                      <a:off x="0" y="0"/>
+                      <a:ext cx="5731510" cy="3854232"/>
+                    </a:xfrm>
+                    <a:prstGeom prst="rect"/>
+                  </pic:spPr>
+                </pic:pic>
+              </a:graphicData>
+            </a:graphic>
+          </wp:inline>
+        </w:drawing>
+      </w:r>
+    </w:p>
+    <w:p>
+      <w:pPr>
+        <w:spacing w:after="200"/>
+        <w:jc w:val="center"/>
+      </w:pPr>
+      <w:r>
+        <w:rPr>
+          <w:i/>
+          <w:color w:val="595959"/>
+          <w:sz w:val="18"/>
+        </w:rPr>
+        <w:t>Figura 7. Transiciones válidas entre estados</w:t>
+      </w:r>
+    </w:p>
+    <w:p>
+      <w:pPr>
         <w:spacing w:before="60" w:after="80"/>
       </w:pPr>
     </w:p>
@@ -5611,6 +5989,60 @@
           <w:bCs/>
         </w:rPr>
         <w:t>Arquitectura backend — Layered / Clean:</w:t>
+      </w:r>
+    </w:p>
+    <w:p>
+      <w:pPr>
+        <w:spacing w:before="120" w:after="40"/>
+        <w:jc w:val="center"/>
+      </w:pPr>
+      <w:r>
+        <w:drawing>
+          <wp:inline xmlns:a="http://schemas.openxmlformats.org/drawingml/2006/main" xmlns:pic="http://schemas.openxmlformats.org/drawingml/2006/picture">
+            <wp:extent cx="5731510" cy="3774669"/>
+            <wp:docPr id="8" name="Picture 8"/>
+            <wp:cNvGraphicFramePr>
+              <a:graphicFrameLocks noChangeAspect="1"/>
+            </wp:cNvGraphicFramePr>
+            <a:graphic>
+              <a:graphicData uri="http://schemas.openxmlformats.org/drawingml/2006/picture">
+                <pic:pic>
+                  <pic:nvPicPr>
+                    <pic:cNvPr id="0" name="Diagrama de capas - backend.png"/>
+                    <pic:cNvPicPr/>
+                  </pic:nvPicPr>
+                  <pic:blipFill>
+                    <a:blip r:embed="rId18"/>
+                    <a:stretch>
+                      <a:fillRect/>
+                    </a:stretch>
+                  </pic:blipFill>
+                  <pic:spPr>
+                    <a:xfrm>
+                      <a:off x="0" y="0"/>
+                      <a:ext cx="5731510" cy="3774669"/>
+                    </a:xfrm>
+                    <a:prstGeom prst="rect"/>
+                  </pic:spPr>
+                </pic:pic>
+              </a:graphicData>
+            </a:graphic>
+          </wp:inline>
+        </w:drawing>
+      </w:r>
+    </w:p>
+    <w:p>
+      <w:pPr>
+        <w:spacing w:after="200"/>
+        <w:jc w:val="center"/>
+      </w:pPr>
+      <w:r>
+        <w:rPr>
+          <w:i/>
+          <w:color w:val="595959"/>
+          <w:sz w:val="18"/>
+        </w:rPr>
+        <w:t>Figura 8. Arquitectura en capas del backend</w:t>
       </w:r>
     </w:p>
     <w:p>
@@ -5765,6 +6197,60 @@
           <w:bCs/>
         </w:rPr>
         <w:t>Arquitectura frontend — MVVM:</w:t>
+      </w:r>
+    </w:p>
+    <w:p>
+      <w:pPr>
+        <w:spacing w:before="120" w:after="40"/>
+        <w:jc w:val="center"/>
+      </w:pPr>
+      <w:r>
+        <w:drawing>
+          <wp:inline xmlns:a="http://schemas.openxmlformats.org/drawingml/2006/main" xmlns:pic="http://schemas.openxmlformats.org/drawingml/2006/picture">
+            <wp:extent cx="4285161" cy="7800000"/>
+            <wp:docPr id="9" name="Picture 9"/>
+            <wp:cNvGraphicFramePr>
+              <a:graphicFrameLocks noChangeAspect="1"/>
+            </wp:cNvGraphicFramePr>
+            <a:graphic>
+              <a:graphicData uri="http://schemas.openxmlformats.org/drawingml/2006/picture">
+                <pic:pic>
+                  <pic:nvPicPr>
+                    <pic:cNvPr id="0" name="Arquitectura MVVM - Frontend.png"/>
+                    <pic:cNvPicPr/>
+                  </pic:nvPicPr>
+                  <pic:blipFill>
+                    <a:blip r:embed="rId19"/>
+                    <a:stretch>
+                      <a:fillRect/>
+                    </a:stretch>
+                  </pic:blipFill>
+                  <pic:spPr>
+                    <a:xfrm>
+                      <a:off x="0" y="0"/>
+                      <a:ext cx="4285161" cy="7800000"/>
+                    </a:xfrm>
+                    <a:prstGeom prst="rect"/>
+                  </pic:spPr>
+                </pic:pic>
+              </a:graphicData>
+            </a:graphic>
+          </wp:inline>
+        </w:drawing>
+      </w:r>
+    </w:p>
+    <w:p>
+      <w:pPr>
+        <w:spacing w:after="200"/>
+        <w:jc w:val="center"/>
+      </w:pPr>
+      <w:r>
+        <w:rPr>
+          <w:i/>
+          <w:color w:val="595959"/>
+          <w:sz w:val="18"/>
+        </w:rPr>
+        <w:t>Figura 9. Arquitectura MVVM del frontend Android</w:t>
       </w:r>
     </w:p>
     <w:p>
@@ -6456,6 +6942,60 @@
     </w:p>
     <w:p>
       <w:pPr>
+        <w:spacing w:before="120" w:after="40"/>
+        <w:jc w:val="center"/>
+      </w:pPr>
+      <w:r>
+        <w:drawing>
+          <wp:inline xmlns:a="http://schemas.openxmlformats.org/drawingml/2006/main" xmlns:pic="http://schemas.openxmlformats.org/drawingml/2006/picture">
+            <wp:extent cx="5731510" cy="646954"/>
+            <wp:docPr id="10" name="Picture 10"/>
+            <wp:cNvGraphicFramePr>
+              <a:graphicFrameLocks noChangeAspect="1"/>
+            </wp:cNvGraphicFramePr>
+            <a:graphic>
+              <a:graphicData uri="http://schemas.openxmlformats.org/drawingml/2006/picture">
+                <pic:pic>
+                  <pic:nvPicPr>
+                    <pic:cNvPr id="0" name="CI-CD Flow.png"/>
+                    <pic:cNvPicPr/>
+                  </pic:nvPicPr>
+                  <pic:blipFill>
+                    <a:blip r:embed="rId20"/>
+                    <a:stretch>
+                      <a:fillRect/>
+                    </a:stretch>
+                  </pic:blipFill>
+                  <pic:spPr>
+                    <a:xfrm>
+                      <a:off x="0" y="0"/>
+                      <a:ext cx="5731510" cy="646954"/>
+                    </a:xfrm>
+                    <a:prstGeom prst="rect"/>
+                  </pic:spPr>
+                </pic:pic>
+              </a:graphicData>
+            </a:graphic>
+          </wp:inline>
+        </w:drawing>
+      </w:r>
+    </w:p>
+    <w:p>
+      <w:pPr>
+        <w:spacing w:after="200"/>
+        <w:jc w:val="center"/>
+      </w:pPr>
+      <w:r>
+        <w:rPr>
+          <w:i/>
+          <w:color w:val="595959"/>
+          <w:sz w:val="18"/>
+        </w:rPr>
+        <w:t>Figura 10. Flujo de integración y despliegue continuo (CI/CD)</w:t>
+      </w:r>
+    </w:p>
+    <w:p>
+      <w:pPr>
         <w:pStyle w:val="Prrafodelista"/>
         <w:numPr>
           <w:ilvl w:val="0"/>
@@ -6508,6 +7048,60 @@
     </w:p>
     <w:p>
       <w:pPr>
+        <w:spacing w:before="120" w:after="40"/>
+        <w:jc w:val="center"/>
+      </w:pPr>
+      <w:r>
+        <w:drawing>
+          <wp:inline xmlns:a="http://schemas.openxmlformats.org/drawingml/2006/main" xmlns:pic="http://schemas.openxmlformats.org/drawingml/2006/picture">
+            <wp:extent cx="5545072" cy="7800000"/>
+            <wp:docPr id="11" name="Picture 11"/>
+            <wp:cNvGraphicFramePr>
+              <a:graphicFrameLocks noChangeAspect="1"/>
+            </wp:cNvGraphicFramePr>
+            <a:graphic>
+              <a:graphicData uri="http://schemas.openxmlformats.org/drawingml/2006/picture">
+                <pic:pic>
+                  <pic:nvPicPr>
+                    <pic:cNvPr id="0" name="Topología general del sistema.png"/>
+                    <pic:cNvPicPr/>
+                  </pic:nvPicPr>
+                  <pic:blipFill>
+                    <a:blip r:embed="rId21"/>
+                    <a:stretch>
+                      <a:fillRect/>
+                    </a:stretch>
+                  </pic:blipFill>
+                  <pic:spPr>
+                    <a:xfrm>
+                      <a:off x="0" y="0"/>
+                      <a:ext cx="5545072" cy="7800000"/>
+                    </a:xfrm>
+                    <a:prstGeom prst="rect"/>
+                  </pic:spPr>
+                </pic:pic>
+              </a:graphicData>
+            </a:graphic>
+          </wp:inline>
+        </w:drawing>
+      </w:r>
+    </w:p>
+    <w:p>
+      <w:pPr>
+        <w:spacing w:after="200"/>
+        <w:jc w:val="center"/>
+      </w:pPr>
+      <w:r>
+        <w:rPr>
+          <w:i/>
+          <w:color w:val="595959"/>
+          <w:sz w:val="18"/>
+        </w:rPr>
+        <w:t>Figura 11. Topología general del sistema</w:t>
+      </w:r>
+    </w:p>
+    <w:p>
+      <w:pPr>
         <w:spacing w:before="60" w:after="80"/>
       </w:pPr>
     </w:p>
@@ -6522,6 +7116,60 @@
           <w:bCs/>
         </w:rPr>
         <w:t>Nodos del sistema:</w:t>
+      </w:r>
+    </w:p>
+    <w:p>
+      <w:pPr>
+        <w:spacing w:before="120" w:after="40"/>
+        <w:jc w:val="center"/>
+      </w:pPr>
+      <w:r>
+        <w:drawing>
+          <wp:inline xmlns:a="http://schemas.openxmlformats.org/drawingml/2006/main" xmlns:pic="http://schemas.openxmlformats.org/drawingml/2006/picture">
+            <wp:extent cx="5731510" cy="3370633"/>
+            <wp:docPr id="12" name="Picture 12"/>
+            <wp:cNvGraphicFramePr>
+              <a:graphicFrameLocks noChangeAspect="1"/>
+            </wp:cNvGraphicFramePr>
+            <a:graphic>
+              <a:graphicData uri="http://schemas.openxmlformats.org/drawingml/2006/picture">
+                <pic:pic>
+                  <pic:nvPicPr>
+                    <pic:cNvPr id="0" name="Diagrama de despliegue 2.png"/>
+                    <pic:cNvPicPr/>
+                  </pic:nvPicPr>
+                  <pic:blipFill>
+                    <a:blip r:embed="rId22"/>
+                    <a:stretch>
+                      <a:fillRect/>
+                    </a:stretch>
+                  </pic:blipFill>
+                  <pic:spPr>
+                    <a:xfrm>
+                      <a:off x="0" y="0"/>
+                      <a:ext cx="5731510" cy="3370633"/>
+                    </a:xfrm>
+                    <a:prstGeom prst="rect"/>
+                  </pic:spPr>
+                </pic:pic>
+              </a:graphicData>
+            </a:graphic>
+          </wp:inline>
+        </w:drawing>
+      </w:r>
+    </w:p>
+    <w:p>
+      <w:pPr>
+        <w:spacing w:after="200"/>
+        <w:jc w:val="center"/>
+      </w:pPr>
+      <w:r>
+        <w:rPr>
+          <w:i/>
+          <w:color w:val="595959"/>
+          <w:sz w:val="18"/>
+        </w:rPr>
+        <w:t>Figura 12. Diagrama de despliegue</w:t>
       </w:r>
     </w:p>
     <w:tbl>
@@ -8008,6 +8656,60 @@
           <w:bCs/>
         </w:rPr>
         <w:t>Casos de uso identificados:</w:t>
+      </w:r>
+    </w:p>
+    <w:p>
+      <w:pPr>
+        <w:spacing w:before="120" w:after="40"/>
+        <w:jc w:val="center"/>
+      </w:pPr>
+      <w:r>
+        <w:drawing>
+          <wp:inline xmlns:a="http://schemas.openxmlformats.org/drawingml/2006/main" xmlns:pic="http://schemas.openxmlformats.org/drawingml/2006/picture">
+            <wp:extent cx="5731510" cy="6802527"/>
+            <wp:docPr id="13" name="Picture 13"/>
+            <wp:cNvGraphicFramePr>
+              <a:graphicFrameLocks noChangeAspect="1"/>
+            </wp:cNvGraphicFramePr>
+            <a:graphic>
+              <a:graphicData uri="http://schemas.openxmlformats.org/drawingml/2006/picture">
+                <pic:pic>
+                  <pic:nvPicPr>
+                    <pic:cNvPr id="0" name="Diagrama de casos de uso.png"/>
+                    <pic:cNvPicPr/>
+                  </pic:nvPicPr>
+                  <pic:blipFill>
+                    <a:blip r:embed="rId23"/>
+                    <a:stretch>
+                      <a:fillRect/>
+                    </a:stretch>
+                  </pic:blipFill>
+                  <pic:spPr>
+                    <a:xfrm>
+                      <a:off x="0" y="0"/>
+                      <a:ext cx="5731510" cy="6802527"/>
+                    </a:xfrm>
+                    <a:prstGeom prst="rect"/>
+                  </pic:spPr>
+                </pic:pic>
+              </a:graphicData>
+            </a:graphic>
+          </wp:inline>
+        </w:drawing>
+      </w:r>
+    </w:p>
+    <w:p>
+      <w:pPr>
+        <w:spacing w:after="200"/>
+        <w:jc w:val="center"/>
+      </w:pPr>
+      <w:r>
+        <w:rPr>
+          <w:i/>
+          <w:color w:val="595959"/>
+          <w:sz w:val="18"/>
+        </w:rPr>
+        <w:t>Figura 13. Diagrama de casos de uso</w:t>
       </w:r>
     </w:p>
     <w:tbl>

</xml_diff>